<commit_message>
Project docx: plain headings (no navigation/collapse), native editable chart
Co-Authored-By: Claude Opus 5.5 <noreply@anthropic.com>
Claude-Session: https://claude.ai/code/session_01GUmUi9gtWJW6PsnDGeagEh
</commit_message>
<xml_diff>
--- a/Индивидуальный_проект_Авиация_ВОВ.docx
+++ b/Индивидуальный_проект_Авиация_ВОВ.docx
@@ -707,7 +707,6 @@
     </w:p>
     <w:p>
       <w:pPr>
-        <w:pStyle w:val="Heading1"/>
         <w:pageBreakBefore/>
         <w:spacing w:after="240"/>
         <w:jc w:val="center"/>
@@ -980,7 +979,6 @@
     </w:p>
     <w:p>
       <w:pPr>
-        <w:pStyle w:val="Heading1"/>
         <w:pageBreakBefore/>
         <w:spacing w:after="240"/>
         <w:jc w:val="center"/>
@@ -998,7 +996,6 @@
     </w:p>
     <w:p>
       <w:pPr>
-        <w:pStyle w:val="Heading2"/>
         <w:keepNext/>
         <w:spacing w:after="240" w:before="240"/>
         <w:ind w:firstLine="709"/>
@@ -1119,7 +1116,6 @@
     </w:p>
     <w:p>
       <w:pPr>
-        <w:pStyle w:val="Heading2"/>
         <w:keepNext/>
         <w:spacing w:after="240" w:before="240"/>
         <w:ind w:firstLine="709"/>
@@ -2368,40 +2364,20 @@
         <w:jc w:val="center"/>
       </w:pPr>
       <w:r>
+        <w:rPr>
+          <w:rFonts w:ascii="Times New Roman" w:cs="Times New Roman" w:eastAsia="Times New Roman" w:hAnsi="Times New Roman"/>
+          <w:sz w:val="28"/>
+          <w:szCs w:val="28"/>
+        </w:rPr>
         <w:drawing>
           <wp:inline distT="0" distB="0" distL="0" distR="0">
-            <wp:extent cx="5334000" cy="2743200"/>
-            <wp:effectExtent t="0" r="0" b="0" l="0"/>
-            <wp:docPr id="1" name="" descr="" title=""/>
-            <wp:cNvGraphicFramePr>
-              <a:graphicFrameLocks xmlns:a="http://schemas.openxmlformats.org/drawingml/2006/main" noChangeAspect="1"/>
-            </wp:cNvGraphicFramePr>
+            <wp:extent cx="5486400" cy="2926080"/>
+            <wp:effectExtent l="0" t="0" r="0" b="0"/>
+            <wp:docPr id="900" name="Диаграмма 1"/>
+            <wp:cNvGraphicFramePr/>
             <a:graphic xmlns:a="http://schemas.openxmlformats.org/drawingml/2006/main">
-              <a:graphicData uri="http://schemas.openxmlformats.org/drawingml/2006/picture">
-                <pic:pic xmlns:pic="http://schemas.openxmlformats.org/drawingml/2006/picture">
-                  <pic:nvPicPr>
-                    <pic:cNvPr id="0" name="" descr=""/>
-                    <pic:cNvPicPr>
-                      <a:picLocks noChangeAspect="1" noChangeArrowheads="1"/>
-                    </pic:cNvPicPr>
-                  </pic:nvPicPr>
-                  <pic:blipFill>
-                    <a:blip r:embed="rId9" cstate="none"/>
-                    <a:srcRect/>
-                    <a:stretch>
-                      <a:fillRect/>
-                    </a:stretch>
-                  </pic:blipFill>
-                  <pic:spPr bwMode="auto">
-                    <a:xfrm>
-                      <a:off x="0" y="0"/>
-                      <a:ext cx="5334000" cy="2743200"/>
-                    </a:xfrm>
-                    <a:prstGeom prst="rect">
-                      <a:avLst/>
-                    </a:prstGeom>
-                  </pic:spPr>
-                </pic:pic>
+              <a:graphicData uri="http://schemas.openxmlformats.org/drawingml/2006/chart">
+                <c:chart xmlns:c="http://schemas.openxmlformats.org/drawingml/2006/chart" xmlns:r="http://schemas.openxmlformats.org/officeDocument/2006/relationships" r:id="rIdChart1"/>
               </a:graphicData>
             </a:graphic>
           </wp:inline>
@@ -2459,7 +2435,6 @@
     </w:p>
     <w:p>
       <w:pPr>
-        <w:pStyle w:val="Heading2"/>
         <w:keepNext/>
         <w:spacing w:after="240" w:before="240"/>
         <w:ind w:firstLine="709"/>
@@ -2529,7 +2504,6 @@
     </w:p>
     <w:p>
       <w:pPr>
-        <w:pStyle w:val="Heading1"/>
         <w:pageBreakBefore/>
         <w:spacing w:after="240"/>
         <w:jc w:val="center"/>
@@ -2547,7 +2521,6 @@
     </w:p>
     <w:p>
       <w:pPr>
-        <w:pStyle w:val="Heading2"/>
         <w:keepNext/>
         <w:spacing w:after="240" w:before="240"/>
         <w:ind w:firstLine="709"/>
@@ -2668,7 +2641,6 @@
     </w:p>
     <w:p>
       <w:pPr>
-        <w:pStyle w:val="Heading2"/>
         <w:keepNext/>
         <w:spacing w:after="240" w:before="240"/>
         <w:ind w:firstLine="709"/>
@@ -2823,7 +2795,6 @@
     </w:p>
     <w:p>
       <w:pPr>
-        <w:pStyle w:val="Heading2"/>
         <w:keepNext/>
         <w:spacing w:after="240" w:before="240"/>
         <w:ind w:firstLine="709"/>
@@ -3669,7 +3640,6 @@
     </w:p>
     <w:p>
       <w:pPr>
-        <w:pStyle w:val="Heading1"/>
         <w:pageBreakBefore/>
         <w:spacing w:after="240"/>
         <w:jc w:val="center"/>
@@ -3806,7 +3776,6 @@
     </w:p>
     <w:p>
       <w:pPr>
-        <w:pStyle w:val="Heading1"/>
         <w:pageBreakBefore/>
         <w:spacing w:after="240"/>
         <w:jc w:val="center"/>
@@ -4004,7 +3973,6 @@
     </w:p>
     <w:p>
       <w:pPr>
-        <w:pStyle w:val="Heading1"/>
         <w:pageBreakBefore/>
         <w:spacing w:after="0"/>
         <w:jc w:val="center"/>
@@ -4880,7 +4848,6 @@
     </w:p>
     <w:p>
       <w:pPr>
-        <w:pStyle w:val="Heading1"/>
         <w:pageBreakBefore/>
         <w:spacing w:after="0"/>
         <w:jc w:val="center"/>
@@ -5203,7 +5170,6 @@
     </w:p>
     <w:p>
       <w:pPr>
-        <w:pStyle w:val="Heading1"/>
         <w:pageBreakBefore/>
         <w:spacing w:after="0"/>
         <w:jc w:val="center"/>
@@ -5784,6 +5750,175 @@
     </w:rPr>
   </w:style>
 </w:styles>
+</file>
+
+<file path=word/charts/chart1.xml><?xml version="1.0" encoding="utf-8"?>
+<c:chartSpace xmlns:c="http://schemas.openxmlformats.org/drawingml/2006/chart" xmlns:a="http://schemas.openxmlformats.org/drawingml/2006/main" xmlns:r="http://schemas.openxmlformats.org/officeDocument/2006/relationships">
+  <c:date1904 val="0"/>
+  <c:chart>
+    <c:autoTitleDeleted val="1"/>
+    <c:plotArea>
+      <c:barChart>
+        <c:barDir val="bar"/>
+        <c:grouping val="clustered"/>
+        <c:ser>
+          <c:idx val="0"/>
+          <c:order val="0"/>
+          <c:tx>
+            <c:strRef>
+              <c:f>Sheet1!$B$1</c:f>
+              <c:strCache>
+                <c:ptCount val="1"/>
+                <c:pt idx="0">
+                  <c:v>Выпущено самолётов, ед.</c:v>
+                </c:pt>
+              </c:strCache>
+            </c:strRef>
+          </c:tx>
+          <c:spPr>
+            <a:solidFill>
+              <a:srgbClr val="4A5D7A"/>
+            </a:solidFill>
+          </c:spPr>
+          <c:cat>
+            <c:strRef>
+              <c:f>Sheet1!$A$2:$A$6</c:f>
+              <c:strCache>
+                <c:ptCount val="5"/>
+                <c:pt idx="0">
+                  <c:v>Як-1</c:v>
+                </c:pt>
+                <c:pt idx="1">
+                  <c:v>Ла-5</c:v>
+                </c:pt>
+                <c:pt idx="2">
+                  <c:v>Пе-2</c:v>
+                </c:pt>
+                <c:pt idx="3">
+                  <c:v>Як-9</c:v>
+                </c:pt>
+                <c:pt idx="4">
+                  <c:v>Ил-2</c:v>
+                </c:pt>
+              </c:strCache>
+            </c:strRef>
+          </c:cat>
+          <c:val>
+            <c:numRef>
+              <c:f>Sheet1!$B$2:$B$6</c:f>
+              <c:numCache>
+                <c:formatCode># ##0</c:formatCode>
+                <c:ptCount val="5"/>
+                <c:pt idx="0">
+                  <c:v>8721</c:v>
+                </c:pt>
+                <c:pt idx="1">
+                  <c:v>9920</c:v>
+                </c:pt>
+                <c:pt idx="2">
+                  <c:v>11427</c:v>
+                </c:pt>
+                <c:pt idx="3">
+                  <c:v>16769</c:v>
+                </c:pt>
+                <c:pt idx="4">
+                  <c:v>36163</c:v>
+                </c:pt>
+              </c:numCache>
+            </c:numRef>
+          </c:val>
+        </c:ser>
+        <c:dLbls>
+          <c:numFmt formatCode="# ##0" sourceLinked="0"/>
+          <c:dLblPos val="outEnd"/>
+          <c:showLegendKey val="0"/>
+          <c:showVal val="1"/>
+          <c:showCatName val="0"/>
+          <c:showSerName val="0"/>
+          <c:showPercent val="0"/>
+          <c:showBubbleSize val="0"/>
+          <c:showLeaderLines val="1"/>
+        </c:dLbls>
+        <c:gapWidth val="60"/>
+        <c:axId val="-2068027336"/>
+        <c:axId val="-2113994440"/>
+      </c:barChart>
+      <c:catAx>
+        <c:axId val="-2068027336"/>
+        <c:scaling>
+          <c:orientation val="minMax"/>
+        </c:scaling>
+        <c:delete val="0"/>
+        <c:axPos val="l"/>
+        <c:majorTickMark val="out"/>
+        <c:minorTickMark val="none"/>
+        <c:tickLblPos val="nextTo"/>
+        <c:crossAx val="-2113994440"/>
+        <c:crosses val="autoZero"/>
+        <c:auto val="1"/>
+        <c:lblAlgn val="ctr"/>
+        <c:lblOffset val="100"/>
+        <c:noMultiLvlLbl val="0"/>
+      </c:catAx>
+      <c:valAx>
+        <c:axId val="-2113994440"/>
+        <c:scaling>
+          <c:max val="40000.0"/>
+          <c:min val="0.0"/>
+        </c:scaling>
+        <c:delete val="0"/>
+        <c:axPos val="b"/>
+        <c:majorGridlines>
+          <c:spPr>
+            <a:ln>
+              <a:solidFill>
+                <a:srgbClr val="D9D9D9"/>
+              </a:solidFill>
+            </a:ln>
+          </c:spPr>
+        </c:majorGridlines>
+        <c:title>
+          <c:tx>
+            <c:rich>
+              <a:bodyPr/>
+              <a:lstStyle/>
+              <a:p>
+                <a:r>
+                  <a:rPr sz="1200" b="0"/>
+                  <a:t>Количество выпущенных самолётов, ед.</a:t>
+                </a:r>
+              </a:p>
+            </c:rich>
+          </c:tx>
+          <c:layout/>
+          <c:overlay val="0"/>
+        </c:title>
+        <c:majorTickMark val="out"/>
+        <c:minorTickMark val="none"/>
+        <c:tickLblPos val="nextTo"/>
+        <c:crossAx val="-2068027336"/>
+        <c:crosses val="autoZero"/>
+        <c:majorUnit val="5000.0"/>
+      </c:valAx>
+    </c:plotArea>
+    <c:dispBlanksAs val="gap"/>
+  </c:chart>
+  <c:txPr>
+    <a:bodyPr/>
+    <a:lstStyle/>
+    <a:p>
+      <a:pPr>
+        <a:defRPr sz="1200">
+          <a:latin typeface="Times New Roman"/>
+        </a:defRPr>
+      </a:pPr>
+      <a:endParaRPr lang="en-US"/>
+    </a:p>
+  </c:txPr>
+  <c:externalData r:id="rId1">
+    <c:autoUpdate val="0"/>
+  </c:externalData>
+</c:chartSpace>
 </file>
 
 <file path=word/theme/theme1.xml><?xml version="1.0" encoding="utf-8"?>

</xml_diff>